<commit_message>
docs: proposta Catalogo CONFERMATA (F1–F4) — branch ref 0.16.52
Co-authored-by: Renato <renatizzi@users.noreply.github.com>
</commit_message>
<xml_diff>
--- a/docs/export/PROPOSTA_RAZIONALIZZAZIONE_CATALOGO.docx
+++ b/docs/export/PROPOSTA_RAZIONALIZZAZIONE_CATALOGO.docx
@@ -2,7 +2,7 @@
 <file path=word/document.xml><?xml version="1.0" encoding="utf-8"?>
 <w:document xmlns:w="http://schemas.openxmlformats.org/wordprocessingml/2006/main" xmlns:m="http://schemas.openxmlformats.org/officeDocument/2006/math" xmlns:r="http://schemas.openxmlformats.org/officeDocument/2006/relationships" xmlns:o="urn:schemas-microsoft-com:office:office" xmlns:v="urn:schemas-microsoft-com:vml" xmlns:w10="urn:schemas-microsoft-com:office:word" xmlns:a="http://schemas.openxmlformats.org/drawingml/2006/main" xmlns:pic="http://schemas.openxmlformats.org/drawingml/2006/picture" xmlns:wp="http://schemas.openxmlformats.org/drawingml/2006/wordprocessingDrawing">
   <w:body>
-    <w:bookmarkStart w:id="48" w:name="Xe29924f7792bad6c6d27009db0ff3acd1f6bf2e"/>
+    <w:bookmarkStart w:id="49" w:name="Xe29924f7792bad6c6d27009db0ff3acd1f6bf2e"/>
     <w:p>
       <w:pPr>
         <w:pStyle w:val="Heading1"/>
@@ -26,33 +26,27 @@
         <w:t xml:space="preserve"> </w:t>
       </w:r>
       <w:r>
-        <w:t xml:space="preserve">PROPOSTA IN ATTESA DI APPROVAZIONE ESPLICITA DI RENATO —</w:t>
-      </w:r>
-      <w:r>
-        <w:t xml:space="preserve"> </w:t>
-      </w:r>
-      <w:r>
         <w:rPr>
           <w:bCs/>
           <w:b/>
         </w:rPr>
-        <w:t xml:space="preserve">nessuna implementazione autorizzata</w:t>
-      </w:r>
-      <w:r>
-        <w:br/>
+        <w:t xml:space="preserve">CONFERMATA</w:t>
+      </w:r>
+      <w:r>
+        <w:t xml:space="preserve"> </w:t>
+      </w:r>
+      <w:r>
+        <w:t xml:space="preserve">Renato 25/10/2026 (F1–F4) — OK finale Cursor: piano chiuso,</w:t>
+      </w:r>
+      <w:r>
+        <w:t xml:space="preserve"> </w:t>
       </w:r>
       <w:r>
         <w:rPr>
           <w:bCs/>
           <w:b/>
         </w:rPr>
-        <w:t xml:space="preserve">Data:</w:t>
-      </w:r>
-      <w:r>
-        <w:t xml:space="preserve"> </w:t>
-      </w:r>
-      <w:r>
-        <w:t xml:space="preserve">25/10/2026 (Europe/Rome)</w:t>
+        <w:t xml:space="preserve">sviluppo autorizzato</w:t>
       </w:r>
       <w:r>
         <w:br/>
@@ -62,29 +56,29 @@
           <w:bCs/>
           <w:b/>
         </w:rPr>
-        <w:t xml:space="preserve">Autore:</w:t>
-      </w:r>
-      <w:r>
-        <w:t xml:space="preserve"> </w:t>
-      </w:r>
-      <w:r>
-        <w:t xml:space="preserve">Cursor (analisi AS-IS + proposta TO-BE)</w:t>
-      </w:r>
-      <w:r>
-        <w:br/>
+        <w:t xml:space="preserve">Data proposta:</w:t>
+      </w:r>
+      <w:r>
+        <w:t xml:space="preserve"> </w:t>
+      </w:r>
+      <w:r>
+        <w:t xml:space="preserve">25/10/2026 ·</w:t>
+      </w:r>
+      <w:r>
+        <w:t xml:space="preserve"> </w:t>
       </w:r>
       <w:r>
         <w:rPr>
           <w:bCs/>
           <w:b/>
         </w:rPr>
-        <w:t xml:space="preserve">Perimetro:</w:t>
-      </w:r>
-      <w:r>
-        <w:t xml:space="preserve"> </w:t>
-      </w:r>
-      <w:r>
-        <w:t xml:space="preserve">A–D del prompt (sede Catalogo, identificazione UI, CIFS/IP, razionalizzazione passi).</w:t>
+        <w:t xml:space="preserve">Conferma decisioni:</w:t>
+      </w:r>
+      <w:r>
+        <w:t xml:space="preserve"> </w:t>
+      </w:r>
+      <w:r>
+        <w:t xml:space="preserve">25/10/2026 (Europe/Rome)</w:t>
       </w:r>
       <w:r>
         <w:br/>
@@ -94,6 +88,38 @@
           <w:bCs/>
           <w:b/>
         </w:rPr>
+        <w:t xml:space="preserve">Autore:</w:t>
+      </w:r>
+      <w:r>
+        <w:t xml:space="preserve"> </w:t>
+      </w:r>
+      <w:r>
+        <w:t xml:space="preserve">Cursor (analisi AS-IS + proposta TO-BE)</w:t>
+      </w:r>
+      <w:r>
+        <w:br/>
+      </w:r>
+      <w:r>
+        <w:rPr>
+          <w:bCs/>
+          <w:b/>
+        </w:rPr>
+        <w:t xml:space="preserve">Perimetro:</w:t>
+      </w:r>
+      <w:r>
+        <w:t xml:space="preserve"> </w:t>
+      </w:r>
+      <w:r>
+        <w:t xml:space="preserve">A–D del prompt (sede Catalogo, identificazione UI, CIFS/IP, razionalizzazione passi).</w:t>
+      </w:r>
+      <w:r>
+        <w:br/>
+      </w:r>
+      <w:r>
+        <w:rPr>
+          <w:bCs/>
+          <w:b/>
+        </w:rPr>
         <w:t xml:space="preserve">Fuori perimetro:</w:t>
       </w:r>
       <w:r>
@@ -103,6 +129,267 @@
         <w:t xml:space="preserve">riprogettazione Acquisisci/Importa/Aggiorna/Pulisci/Ricerca (salvo integrazioni minime per la sede).</w:t>
       </w:r>
     </w:p>
+    <w:bookmarkStart w:id="20" w:name="branch-di-riferimento-definitivo-f1"/>
+    <w:p>
+      <w:pPr>
+        <w:pStyle w:val="Heading3"/>
+      </w:pPr>
+      <w:r>
+        <w:t xml:space="preserve">Branch di riferimento definitivo (F1)</w:t>
+      </w:r>
+    </w:p>
+    <w:tbl>
+      <w:tblPr>
+        <w:tblStyle w:val="Table"/>
+        <w:tblW w:type="pct" w:w="5000"/>
+        <w:tblLook w:firstRow="1" w:lastRow="0" w:firstColumn="0" w:lastColumn="0" w:noHBand="0" w:noVBand="0" w:val="0020"/>
+        <w:jc w:val="start"/>
+      </w:tblPr>
+      <w:tblGrid>
+        <w:gridCol w:w="3960"/>
+        <w:gridCol w:w="3960"/>
+      </w:tblGrid>
+      <w:tr>
+        <w:trPr>
+          <w:tblHeader w:val="true"/>
+        </w:trPr>
+        <w:tc>
+          <w:tcPr/>
+          <w:p>
+            <w:pPr>
+              <w:pStyle w:val="Compact"/>
+              <w:jc w:val="left"/>
+            </w:pPr>
+            <w:r>
+              <w:t xml:space="preserve">Campo</w:t>
+            </w:r>
+          </w:p>
+        </w:tc>
+        <w:tc>
+          <w:tcPr/>
+          <w:p>
+            <w:pPr>
+              <w:pStyle w:val="Compact"/>
+              <w:jc w:val="left"/>
+            </w:pPr>
+            <w:r>
+              <w:t xml:space="preserve">Valore</w:t>
+            </w:r>
+          </w:p>
+        </w:tc>
+      </w:tr>
+      <w:tr>
+        <w:tc>
+          <w:tcPr/>
+          <w:p>
+            <w:pPr>
+              <w:pStyle w:val="Compact"/>
+              <w:jc w:val="left"/>
+            </w:pPr>
+            <w:r>
+              <w:t xml:space="preserve">Branch</w:t>
+            </w:r>
+          </w:p>
+        </w:tc>
+        <w:tc>
+          <w:tcPr/>
+          <w:p>
+            <w:pPr>
+              <w:pStyle w:val="Compact"/>
+              <w:jc w:val="left"/>
+            </w:pPr>
+            <w:r>
+              <w:rPr>
+                <w:rStyle w:val="VerbatimChar"/>
+              </w:rPr>
+              <w:t xml:space="preserve">cursor/cifs-user-folder-attiva-b602</w:t>
+            </w:r>
+          </w:p>
+        </w:tc>
+      </w:tr>
+      <w:tr>
+        <w:tc>
+          <w:tcPr/>
+          <w:p>
+            <w:pPr>
+              <w:pStyle w:val="Compact"/>
+              <w:jc w:val="left"/>
+            </w:pPr>
+            <w:r>
+              <w:t xml:space="preserve">Tip verificato</w:t>
+            </w:r>
+          </w:p>
+        </w:tc>
+        <w:tc>
+          <w:tcPr/>
+          <w:p>
+            <w:pPr>
+              <w:pStyle w:val="Compact"/>
+              <w:jc w:val="left"/>
+            </w:pPr>
+            <w:r>
+              <w:rPr>
+                <w:rStyle w:val="VerbatimChar"/>
+              </w:rPr>
+              <w:t xml:space="preserve">ee88a9a6ab8317e41e4eb2396febf246d62e3d31</w:t>
+            </w:r>
+            <w:r>
+              <w:t xml:space="preserve"> </w:t>
+            </w:r>
+            <w:r>
+              <w:t xml:space="preserve">(23/10/2026)</w:t>
+            </w:r>
+          </w:p>
+        </w:tc>
+      </w:tr>
+      <w:tr>
+        <w:tc>
+          <w:tcPr/>
+          <w:p>
+            <w:pPr>
+              <w:pStyle w:val="Compact"/>
+              <w:jc w:val="left"/>
+            </w:pPr>
+            <w:r>
+              <w:t xml:space="preserve">Versione</w:t>
+            </w:r>
+          </w:p>
+        </w:tc>
+        <w:tc>
+          <w:tcPr/>
+          <w:p>
+            <w:pPr>
+              <w:pStyle w:val="Compact"/>
+              <w:jc w:val="left"/>
+            </w:pPr>
+            <w:r>
+              <w:rPr>
+                <w:bCs/>
+                <w:b/>
+              </w:rPr>
+              <w:t xml:space="preserve">0.16.52-preview</w:t>
+            </w:r>
+            <w:r>
+              <w:t xml:space="preserve"> </w:t>
+            </w:r>
+            <w:r>
+              <w:t xml:space="preserve">· versionCode</w:t>
+            </w:r>
+            <w:r>
+              <w:t xml:space="preserve"> </w:t>
+            </w:r>
+            <w:r>
+              <w:rPr>
+                <w:bCs/>
+                <w:b/>
+              </w:rPr>
+              <w:t xml:space="preserve">93</w:t>
+            </w:r>
+          </w:p>
+        </w:tc>
+      </w:tr>
+      <w:tr>
+        <w:tc>
+          <w:tcPr/>
+          <w:p>
+            <w:pPr>
+              <w:pStyle w:val="Compact"/>
+              <w:jc w:val="left"/>
+            </w:pPr>
+            <w:r>
+              <w:t xml:space="preserve">Rapporto con base</w:t>
+            </w:r>
+            <w:r>
+              <w:t xml:space="preserve"> </w:t>
+            </w:r>
+            <w:r>
+              <w:rPr>
+                <w:rStyle w:val="VerbatimChar"/>
+              </w:rPr>
+              <w:t xml:space="preserve">prompt-continuita-allineamento-5311</w:t>
+            </w:r>
+          </w:p>
+        </w:tc>
+        <w:tc>
+          <w:tcPr/>
+          <w:p>
+            <w:pPr>
+              <w:pStyle w:val="Compact"/>
+              <w:jc w:val="left"/>
+            </w:pPr>
+            <w:r>
+              <w:t xml:space="preserve">+24 commit (include Wizard PC e Acquisisci sede/gruppi); merge-base</w:t>
+            </w:r>
+            <w:r>
+              <w:t xml:space="preserve"> </w:t>
+            </w:r>
+            <w:r>
+              <w:rPr>
+                <w:rStyle w:val="VerbatimChar"/>
+              </w:rPr>
+              <w:t xml:space="preserve">e0e0662</w:t>
+            </w:r>
+            <w:r>
+              <w:t xml:space="preserve"> </w:t>
+            </w:r>
+            <w:r>
+              <w:t xml:space="preserve">(0.16.37)</w:t>
+            </w:r>
+          </w:p>
+        </w:tc>
+      </w:tr>
+      <w:tr>
+        <w:tc>
+          <w:tcPr/>
+          <w:p>
+            <w:pPr>
+              <w:pStyle w:val="Compact"/>
+              <w:jc w:val="left"/>
+            </w:pPr>
+            <w:r>
+              <w:t xml:space="preserve">Tranche di sviluppo</w:t>
+            </w:r>
+          </w:p>
+        </w:tc>
+        <w:tc>
+          <w:tcPr/>
+          <w:p>
+            <w:pPr>
+              <w:pStyle w:val="Compact"/>
+              <w:jc w:val="left"/>
+            </w:pPr>
+            <w:r>
+              <w:t xml:space="preserve">nuovo branch</w:t>
+            </w:r>
+            <w:r>
+              <w:t xml:space="preserve"> </w:t>
+            </w:r>
+            <w:r>
+              <w:rPr>
+                <w:rStyle w:val="VerbatimChar"/>
+              </w:rPr>
+              <w:t xml:space="preserve">cursor/catalogo-sede-ux-ip-b602</w:t>
+            </w:r>
+            <w:r>
+              <w:t xml:space="preserve"> </w:t>
+            </w:r>
+            <w:r>
+              <w:rPr>
+                <w:bCs/>
+                <w:b/>
+              </w:rPr>
+              <w:t xml:space="preserve">partendo da</w:t>
+            </w:r>
+            <w:r>
+              <w:t xml:space="preserve"> </w:t>
+            </w:r>
+            <w:r>
+              <w:t xml:space="preserve">tip 0.16.52 sopra</w:t>
+            </w:r>
+          </w:p>
+        </w:tc>
+      </w:tr>
+    </w:tbl>
     <w:p>
       <w:r>
         <w:pict>
@@ -110,7 +397,8 @@
         </w:pict>
       </w:r>
     </w:p>
-    <w:bookmarkStart w:id="20" w:name="premessa-metodologica"/>
+    <w:bookmarkEnd w:id="20"/>
+    <w:bookmarkStart w:id="21" w:name="premessa-metodologica"/>
     <w:p>
       <w:pPr>
         <w:pStyle w:val="Heading2"/>
@@ -191,8 +479,8 @@
         </w:pict>
       </w:r>
     </w:p>
-    <w:bookmarkEnd w:id="20"/>
-    <w:bookmarkStart w:id="25" w:name="a.-stato-as-is-verificato"/>
+    <w:bookmarkEnd w:id="21"/>
+    <w:bookmarkStart w:id="26" w:name="a.-stato-as-is-verificato"/>
     <w:p>
       <w:pPr>
         <w:pStyle w:val="Heading2"/>
@@ -201,7 +489,7 @@
         <w:t xml:space="preserve">A. Stato AS-IS verificato</w:t>
       </w:r>
     </w:p>
-    <w:bookmarkStart w:id="21" w:name="a.1-branch-e-versioni-esaminati"/>
+    <w:bookmarkStart w:id="22" w:name="a.1-branch-e-versioni-esaminati"/>
     <w:p>
       <w:pPr>
         <w:pStyle w:val="Heading3"/>
@@ -672,8 +960,8 @@
         <w:t xml:space="preserve">.</w:t>
       </w:r>
     </w:p>
-    <w:bookmarkEnd w:id="21"/>
-    <w:bookmarkStart w:id="22" w:name="a.2-flusso-as-is-sintesi"/>
+    <w:bookmarkEnd w:id="22"/>
+    <w:bookmarkStart w:id="23" w:name="a.2-flusso-as-is-sintesi"/>
     <w:p>
       <w:pPr>
         <w:pStyle w:val="Heading3"/>
@@ -864,8 +1152,8 @@
         <w:t xml:space="preserve">[Importa] → [Aggiorna] → [Pulisci] / [Ricerca]  (preservati)</w:t>
       </w:r>
     </w:p>
-    <w:bookmarkEnd w:id="22"/>
-    <w:bookmarkStart w:id="23" w:name="X5b24342054399106b906a1343aaa37cbb594322"/>
+    <w:bookmarkEnd w:id="23"/>
+    <w:bookmarkStart w:id="24" w:name="X5b24342054399106b906a1343aaa37cbb594322"/>
     <w:p>
       <w:pPr>
         <w:pStyle w:val="Heading3"/>
@@ -1479,8 +1767,8 @@
         </w:tc>
       </w:tr>
     </w:tbl>
-    <w:bookmarkEnd w:id="23"/>
-    <w:bookmarkStart w:id="24" w:name="a.4-problemi-uxtecnici-rilevanti-as-is"/>
+    <w:bookmarkEnd w:id="24"/>
+    <w:bookmarkStart w:id="25" w:name="a.4-problemi-uxtecnici-rilevanti-as-is"/>
     <w:p>
       <w:pPr>
         <w:pStyle w:val="Heading3"/>
@@ -1701,9 +1989,9 @@
         </w:pict>
       </w:r>
     </w:p>
-    <w:bookmarkEnd w:id="24"/>
     <w:bookmarkEnd w:id="25"/>
-    <w:bookmarkStart w:id="31" w:name="b.-flow-chart-to-be"/>
+    <w:bookmarkEnd w:id="26"/>
+    <w:bookmarkStart w:id="32" w:name="b.-flow-chart-to-be"/>
     <w:p>
       <w:pPr>
         <w:pStyle w:val="Heading2"/>
@@ -1712,7 +2000,7 @@
         <w:t xml:space="preserve">B. Flow chart TO-BE</w:t>
       </w:r>
     </w:p>
-    <w:bookmarkStart w:id="26" w:name="Xecfa41f95dadf86c891927615cf57dece7238cb"/>
+    <w:bookmarkStart w:id="27" w:name="Xecfa41f95dadf86c891927615cf57dece7238cb"/>
     <w:p>
       <w:pPr>
         <w:pStyle w:val="Heading3"/>
@@ -1890,8 +2178,8 @@
         <w:t xml:space="preserve">nel merito; solo aggiunta/riuso del blocco sede.</w:t>
       </w:r>
     </w:p>
-    <w:bookmarkEnd w:id="26"/>
-    <w:bookmarkStart w:id="27" w:name="b.2-percorso-unico"/>
+    <w:bookmarkEnd w:id="27"/>
+    <w:bookmarkStart w:id="28" w:name="b.2-percorso-unico"/>
     <w:p>
       <w:pPr>
         <w:pStyle w:val="Heading3"/>
@@ -2252,8 +2540,8 @@
         <w:t xml:space="preserve">*Stato mostrato solo se verificabile in quel momento; altrimenti «non verificabile».</w:t>
       </w:r>
     </w:p>
-    <w:bookmarkEnd w:id="27"/>
-    <w:bookmarkStart w:id="28" w:name="Xa36b8ab4c11f6d4bb6b566617008957907600eb"/>
+    <w:bookmarkEnd w:id="28"/>
+    <w:bookmarkStart w:id="29" w:name="Xa36b8ab4c11f6d4bb6b566617008957907600eb"/>
     <w:p>
       <w:pPr>
         <w:pStyle w:val="Heading3"/>
@@ -2390,8 +2678,8 @@
         <w:t xml:space="preserve">Motivazione: evita di rifare USB/script quando GeeKom/DELL hanno già la share; non crea un secondo motore.</w:t>
       </w:r>
     </w:p>
-    <w:bookmarkEnd w:id="28"/>
-    <w:bookmarkStart w:id="29" w:name="b.4-dove-compare-la-sede-to-be"/>
+    <w:bookmarkEnd w:id="29"/>
+    <w:bookmarkStart w:id="30" w:name="b.4-dove-compare-la-sede-to-be"/>
     <w:p>
       <w:pPr>
         <w:pStyle w:val="Heading3"/>
@@ -2615,8 +2903,8 @@
         <w:t xml:space="preserve">ridisegnare Dashboard KPI.</w:t>
       </w:r>
     </w:p>
-    <w:bookmarkEnd w:id="29"/>
-    <w:bookmarkStart w:id="30" w:name="b.5-errori-e-ritorni"/>
+    <w:bookmarkEnd w:id="30"/>
+    <w:bookmarkStart w:id="31" w:name="b.5-errori-e-ritorni"/>
     <w:p>
       <w:pPr>
         <w:pStyle w:val="Heading3"/>
@@ -2689,9 +2977,9 @@
         </w:pict>
       </w:r>
     </w:p>
-    <w:bookmarkEnd w:id="30"/>
     <w:bookmarkEnd w:id="31"/>
-    <w:bookmarkStart w:id="32" w:name="c.-matrice-as-is-to-be"/>
+    <w:bookmarkEnd w:id="32"/>
+    <w:bookmarkStart w:id="33" w:name="c.-matrice-as-is-to-be"/>
     <w:p>
       <w:pPr>
         <w:pStyle w:val="Heading2"/>
@@ -3687,8 +3975,8 @@
         </w:pict>
       </w:r>
     </w:p>
-    <w:bookmarkEnd w:id="32"/>
-    <w:bookmarkStart w:id="38" w:name="d.-analisi-tecnica-recupero-ip-cifs"/>
+    <w:bookmarkEnd w:id="33"/>
+    <w:bookmarkStart w:id="39" w:name="d.-analisi-tecnica-recupero-ip-cifs"/>
     <w:p>
       <w:pPr>
         <w:pStyle w:val="Heading2"/>
@@ -3697,7 +3985,7 @@
         <w:t xml:space="preserve">D. Analisi tecnica recupero IP (CIFS)</w:t>
       </w:r>
     </w:p>
-    <w:bookmarkStart w:id="33" w:name="Xe6688e4b8f5ebe36ce44ea1e8f4790b04cdf801"/>
+    <w:bookmarkStart w:id="34" w:name="Xe6688e4b8f5ebe36ce44ea1e8f4790b04cdf801"/>
     <w:p>
       <w:pPr>
         <w:pStyle w:val="Heading3"/>
@@ -3958,8 +4246,8 @@
         <w:t xml:space="preserve">è l’IP del tablet: è l’IP annunciato dal PC (o scoperto come peer HTTP).</w:t>
       </w:r>
     </w:p>
-    <w:bookmarkEnd w:id="33"/>
-    <w:bookmarkStart w:id="34" w:name="d.2-affidabilità-esito-prove"/>
+    <w:bookmarkEnd w:id="34"/>
+    <w:bookmarkStart w:id="35" w:name="d.2-affidabilità-esito-prove"/>
     <w:p>
       <w:pPr>
         <w:pStyle w:val="Heading3"/>
@@ -4198,8 +4486,8 @@
         <w:t xml:space="preserve">è una base UX consolidata.</w:t>
       </w:r>
     </w:p>
-    <w:bookmarkEnd w:id="34"/>
-    <w:bookmarkStart w:id="35" w:name="d.3-soluzione-raccomandata-unica"/>
+    <w:bookmarkEnd w:id="35"/>
+    <w:bookmarkStart w:id="36" w:name="d.3-soluzione-raccomandata-unica"/>
     <w:p>
       <w:pPr>
         <w:pStyle w:val="Heading3"/>
@@ -4487,8 +4775,8 @@
         <w:t xml:space="preserve">sul PC, in «Tutto pronto», mostrare IP in grande (e/o QR testo) da ricopiare — riduce dipendenza dalla rete senza nuovo client Windows.</w:t>
       </w:r>
     </w:p>
-    <w:bookmarkEnd w:id="35"/>
-    <w:bookmarkStart w:id="36" w:name="d.4-componenti-coinvolti"/>
+    <w:bookmarkEnd w:id="36"/>
+    <w:bookmarkStart w:id="37" w:name="d.4-componenti-coinvolti"/>
     <w:p>
       <w:pPr>
         <w:pStyle w:val="Heading3"/>
@@ -4606,8 +4894,8 @@
         <w:t xml:space="preserve">sblocco approvato</w:t>
       </w:r>
     </w:p>
-    <w:bookmarkEnd w:id="36"/>
-    <w:bookmarkStart w:id="37" w:name="d.5-test-necessari-ip"/>
+    <w:bookmarkEnd w:id="37"/>
+    <w:bookmarkStart w:id="38" w:name="d.5-test-necessari-ip"/>
     <w:p>
       <w:pPr>
         <w:pStyle w:val="Heading3"/>
@@ -4723,9 +5011,9 @@
         </w:pict>
       </w:r>
     </w:p>
-    <w:bookmarkEnd w:id="37"/>
     <w:bookmarkEnd w:id="38"/>
-    <w:bookmarkStart w:id="44" w:name="e.-piano-di-intervento-post-approvazione"/>
+    <w:bookmarkEnd w:id="39"/>
+    <w:bookmarkStart w:id="45" w:name="e.-piano-di-intervento-post-approvazione"/>
     <w:p>
       <w:pPr>
         <w:pStyle w:val="Heading2"/>
@@ -4734,7 +5022,7 @@
         <w:t xml:space="preserve">E. Piano di intervento (post-approvazione)</w:t>
       </w:r>
     </w:p>
-    <w:bookmarkStart w:id="39" w:name="Xad91258cda68366cb9e342bdb0acc8c7c87ae98"/>
+    <w:bookmarkStart w:id="40" w:name="Xad91258cda68366cb9e342bdb0acc8c7c87ae98"/>
     <w:p>
       <w:pPr>
         <w:pStyle w:val="Heading3"/>
@@ -4783,8 +5071,8 @@
         <w:t xml:space="preserve">il blocco Acquisisci sede duplica lavoro già fatto.</w:t>
       </w:r>
     </w:p>
-    <w:bookmarkEnd w:id="39"/>
-    <w:bookmarkStart w:id="40" w:name="e.1-ordine-attività-dopo-ok-renato"/>
+    <w:bookmarkEnd w:id="40"/>
+    <w:bookmarkStart w:id="41" w:name="e.1-ordine-attività-dopo-ok-renato"/>
     <w:p>
       <w:pPr>
         <w:pStyle w:val="Heading3"/>
@@ -5181,8 +5469,8 @@
         </w:tc>
       </w:tr>
     </w:tbl>
-    <w:bookmarkEnd w:id="40"/>
-    <w:bookmarkStart w:id="41" w:name="e.2-dipendenze-dirette"/>
+    <w:bookmarkEnd w:id="41"/>
+    <w:bookmarkStart w:id="42" w:name="e.2-dipendenze-dirette"/>
     <w:p>
       <w:pPr>
         <w:pStyle w:val="Heading3"/>
@@ -5260,8 +5548,8 @@
         <w:t xml:space="preserve">Non toccare Importa/Pulisci/Ricerca salvo wiring sede.</w:t>
       </w:r>
     </w:p>
-    <w:bookmarkEnd w:id="41"/>
-    <w:bookmarkStart w:id="42" w:name="X5c1f6368e42fb9438751823764c37701ac80f15"/>
+    <w:bookmarkEnd w:id="42"/>
+    <w:bookmarkStart w:id="43" w:name="X5c1f6368e42fb9438751823764c37701ac80f15"/>
     <w:p>
       <w:pPr>
         <w:pStyle w:val="Heading3"/>
@@ -5421,8 +5709,8 @@
         <w:t xml:space="preserve">senza verifica effettiva.</w:t>
       </w:r>
     </w:p>
-    <w:bookmarkEnd w:id="42"/>
-    <w:bookmarkStart w:id="43" w:name="e.4-regressione"/>
+    <w:bookmarkEnd w:id="43"/>
+    <w:bookmarkStart w:id="44" w:name="e.4-regressione"/>
     <w:p>
       <w:pPr>
         <w:pStyle w:val="Heading3"/>
@@ -5480,15 +5768,15 @@
         </w:pict>
       </w:r>
     </w:p>
-    <w:bookmarkEnd w:id="43"/>
     <w:bookmarkEnd w:id="44"/>
-    <w:bookmarkStart w:id="45" w:name="Xe845fbd0d0c01be9e49895a5394cd0ea8003511"/>
+    <w:bookmarkEnd w:id="45"/>
+    <w:bookmarkStart w:id="46" w:name="f.-decisioni-renato-chiuse-25102026"/>
     <w:p>
       <w:pPr>
         <w:pStyle w:val="Heading2"/>
       </w:pPr>
       <w:r>
-        <w:t xml:space="preserve">F. Criticità residue (solo decisioni Renato)</w:t>
+        <w:t xml:space="preserve">F. Decisioni Renato — CHIUSE 25/10/2026</w:t>
       </w:r>
     </w:p>
     <w:tbl>
@@ -5499,10 +5787,9 @@
         <w:jc w:val="start"/>
       </w:tblPr>
       <w:tblGrid>
-        <w:gridCol w:w="1980"/>
-        <w:gridCol w:w="1980"/>
-        <w:gridCol w:w="1980"/>
-        <w:gridCol w:w="1980"/>
+        <w:gridCol w:w="2640"/>
+        <w:gridCol w:w="2640"/>
+        <w:gridCol w:w="2640"/>
       </w:tblGrid>
       <w:tr>
         <w:trPr>
@@ -5528,31 +5815,19 @@
               <w:jc w:val="left"/>
             </w:pPr>
             <w:r>
-              <w:t xml:space="preserve">Decisione</w:t>
-            </w:r>
-          </w:p>
-        </w:tc>
-        <w:tc>
-          <w:tcPr/>
-          <w:p>
-            <w:pPr>
-              <w:pStyle w:val="Compact"/>
-              <w:jc w:val="left"/>
-            </w:pPr>
-            <w:r>
-              <w:t xml:space="preserve">Perché serve Renato</w:t>
-            </w:r>
-          </w:p>
-        </w:tc>
-        <w:tc>
-          <w:tcPr/>
-          <w:p>
-            <w:pPr>
-              <w:pStyle w:val="Compact"/>
-              <w:jc w:val="left"/>
-            </w:pPr>
-            <w:r>
-              <w:t xml:space="preserve">Alternative tecnicamente sostenibili</w:t>
+              <w:t xml:space="preserve">Decisione chiusa</w:t>
+            </w:r>
+          </w:p>
+        </w:tc>
+        <w:tc>
+          <w:tcPr/>
+          <w:p>
+            <w:pPr>
+              <w:pStyle w:val="Compact"/>
+              <w:jc w:val="left"/>
+            </w:pPr>
+            <w:r>
+              <w:t xml:space="preserve">Impatto sul piano</w:t>
             </w:r>
           </w:p>
         </w:tc>
@@ -5582,7 +5857,7 @@
               <w:jc w:val="left"/>
             </w:pPr>
             <w:r>
-              <w:t xml:space="preserve">Branch di partenza: consolidare</w:t>
+              <w:t xml:space="preserve">Partire da</w:t>
             </w:r>
             <w:r>
               <w:t xml:space="preserve"> </w:t>
@@ -5592,37 +5867,49 @@
                 <w:bCs/>
                 <w:b/>
               </w:rPr>
-              <w:t xml:space="preserve">0.16.52</w:t>
+              <w:t xml:space="preserve">0.16.52 consolidata</w:t>
             </w:r>
             <w:r>
               <w:t xml:space="preserve"> </w:t>
             </w:r>
             <w:r>
-              <w:t xml:space="preserve">nella base prima della tranche, oppure rifare il minimo sede su 0.16.37?</w:t>
-            </w:r>
-          </w:p>
-        </w:tc>
-        <w:tc>
-          <w:tcPr/>
-          <w:p>
-            <w:pPr>
-              <w:pStyle w:val="Compact"/>
-              <w:jc w:val="left"/>
-            </w:pPr>
-            <w:r>
-              <w:t xml:space="preserve">Evita doppio lavoro e discordanze tablet/CI</w:t>
-            </w:r>
-          </w:p>
-        </w:tc>
-        <w:tc>
-          <w:tcPr/>
-          <w:p>
-            <w:pPr>
-              <w:pStyle w:val="Compact"/>
-              <w:jc w:val="left"/>
-            </w:pPr>
-            <w:r>
-              <w:t xml:space="preserve">(a) merge/rebase 0.16.52 → base; (b) cherry-pick solo UI sede Acquisisci</w:t>
+              <w:t xml:space="preserve">(</w:t>
+            </w:r>
+            <w:r>
+              <w:rPr>
+                <w:rStyle w:val="VerbatimChar"/>
+              </w:rPr>
+              <w:t xml:space="preserve">ee88a9a</w:t>
+            </w:r>
+            <w:r>
+              <w:t xml:space="preserve"> </w:t>
+            </w:r>
+            <w:r>
+              <w:t xml:space="preserve">su</w:t>
+            </w:r>
+            <w:r>
+              <w:t xml:space="preserve"> </w:t>
+            </w:r>
+            <w:r>
+              <w:rPr>
+                <w:rStyle w:val="VerbatimChar"/>
+              </w:rPr>
+              <w:t xml:space="preserve">cifs-user-folder-attiva-b602</w:t>
+            </w:r>
+            <w:r>
+              <w:t xml:space="preserve">); non rifare Acquisisci</w:t>
+            </w:r>
+          </w:p>
+        </w:tc>
+        <w:tc>
+          <w:tcPr/>
+          <w:p>
+            <w:pPr>
+              <w:pStyle w:val="Compact"/>
+              <w:jc w:val="left"/>
+            </w:pPr>
+            <w:r>
+              <w:t xml:space="preserve">Branch di lavoro da tip 0.16.52; documentato in testa</w:t>
             </w:r>
           </w:p>
         </w:tc>
@@ -5652,47 +5939,51 @@
               <w:jc w:val="left"/>
             </w:pPr>
             <w:r>
-              <w:t xml:space="preserve">IP CIFS: adottare §D «assistenza + manuale sempre», oppure</w:t>
-            </w:r>
-            <w:r>
-              <w:t xml:space="preserve"> </w:t>
-            </w:r>
-            <w:r>
               <w:rPr>
                 <w:bCs/>
                 <w:b/>
               </w:rPr>
-              <w:t xml:space="preserve">lasciare parcheggiato</w:t>
+              <w:t xml:space="preserve">Assistenza IP §D</w:t>
+            </w:r>
+            <w:r>
+              <w:t xml:space="preserve">: Host sempre modificabile; manuale sempre;</w:t>
             </w:r>
             <w:r>
               <w:t xml:space="preserve"> </w:t>
             </w:r>
             <w:r>
-              <w:t xml:space="preserve">l’auto‑IP e solo ripristinare Riprova/UX Host?</w:t>
-            </w:r>
-          </w:p>
-        </w:tc>
-        <w:tc>
-          <w:tcPr/>
-          <w:p>
-            <w:pPr>
-              <w:pStyle w:val="Compact"/>
-              <w:jc w:val="left"/>
-            </w:pPr>
-            <w:r>
-              <w:t xml:space="preserve">Auto‑IP ha già consumato molti cicli; il prompt lo richiede di nuovo in analisi</w:t>
-            </w:r>
-          </w:p>
-        </w:tc>
-        <w:tc>
-          <w:tcPr/>
-          <w:p>
-            <w:pPr>
-              <w:pStyle w:val="Compact"/>
-              <w:jc w:val="left"/>
-            </w:pPr>
-            <w:r>
-              <w:t xml:space="preserve">(a) §D completo; (b) parcheggio resta, solo Host editabile chiaro + guida «trova IP su Windows»</w:t>
+              <w:rPr>
+                <w:bCs/>
+                <w:b/>
+              </w:rPr>
+              <w:t xml:space="preserve">Riprova sempre</w:t>
+            </w:r>
+            <w:r>
+              <w:t xml:space="preserve">; niente scan LAN generalizzata</w:t>
+            </w:r>
+          </w:p>
+        </w:tc>
+        <w:tc>
+          <w:tcPr/>
+          <w:p>
+            <w:pPr>
+              <w:pStyle w:val="Compact"/>
+              <w:jc w:val="left"/>
+            </w:pPr>
+            <w:r>
+              <w:t xml:space="preserve">Implementare §D; togliere il parcheggio</w:t>
+            </w:r>
+            <w:r>
+              <w:t xml:space="preserve"> </w:t>
+            </w:r>
+            <w:r>
+              <w:t xml:space="preserve">“</w:t>
+            </w:r>
+            <w:r>
+              <w:t xml:space="preserve">solo manuale</w:t>
+            </w:r>
+            <w:r>
+              <w:t xml:space="preserve">”</w:t>
             </w:r>
           </w:p>
         </w:tc>
@@ -5722,47 +6013,39 @@
               <w:jc w:val="left"/>
             </w:pPr>
             <w:r>
-              <w:t xml:space="preserve">W2: introdurre la domanda «share già pronta?» (scorciatoia alle</w:t>
-            </w:r>
-            <w:r>
-              <w:t xml:space="preserve"> </w:t>
-            </w:r>
-            <w:r>
               <w:rPr>
                 <w:bCs/>
                 <w:b/>
               </w:rPr>
-              <w:t xml:space="preserve">stesse</w:t>
+              <w:t xml:space="preserve">SÌ</w:t>
             </w:r>
             <w:r>
               <w:t xml:space="preserve"> </w:t>
             </w:r>
             <w:r>
-              <w:t xml:space="preserve">verifiche)?</w:t>
-            </w:r>
-          </w:p>
-        </w:tc>
-        <w:tc>
-          <w:tcPr/>
-          <w:p>
-            <w:pPr>
-              <w:pStyle w:val="Compact"/>
-              <w:jc w:val="left"/>
-            </w:pPr>
-            <w:r>
-              <w:t xml:space="preserve">Accorcia chi ha già CIFS; rischia di saltare checklist se usata male</w:t>
-            </w:r>
-          </w:p>
-        </w:tc>
-        <w:tc>
-          <w:tcPr/>
-          <w:p>
-            <w:pPr>
-              <w:pStyle w:val="Compact"/>
-              <w:jc w:val="left"/>
-            </w:pPr>
-            <w:r>
-              <w:t xml:space="preserve">(a) sì come in §B.3; (b) no, sempre Passi 1–5</w:t>
+              <w:t xml:space="preserve">domanda W2 «cartella condivisa già pronta e raggiungibile?»: Sì→CIFS+pick; No→preparazione guidata;</w:t>
+            </w:r>
+            <w:r>
+              <w:t xml:space="preserve"> </w:t>
+            </w:r>
+            <w:r>
+              <w:rPr>
+                <w:bCs/>
+                <w:b/>
+              </w:rPr>
+              <w:t xml:space="preserve">stesse verifiche finali</w:t>
+            </w:r>
+          </w:p>
+        </w:tc>
+        <w:tc>
+          <w:tcPr/>
+          <w:p>
+            <w:pPr>
+              <w:pStyle w:val="Compact"/>
+              <w:jc w:val="left"/>
+            </w:pPr>
+            <w:r>
+              <w:t xml:space="preserve">Come §B.3</w:t>
             </w:r>
           </w:p>
         </w:tc>
@@ -5792,7 +6075,17 @@
               <w:jc w:val="left"/>
             </w:pPr>
             <w:r>
-              <w:t xml:space="preserve">Estendere la riga sede anche ad</w:t>
+              <w:rPr>
+                <w:bCs/>
+                <w:b/>
+              </w:rPr>
+              <w:t xml:space="preserve">SÌ</w:t>
+            </w:r>
+            <w:r>
+              <w:t xml:space="preserve"> </w:t>
+            </w:r>
+            <w:r>
+              <w:t xml:space="preserve">riga sede compatta anche in</w:t>
             </w:r>
             <w:r>
               <w:t xml:space="preserve"> </w:t>
@@ -5805,34 +6098,19 @@
               <w:t xml:space="preserve">Aggiorna</w:t>
             </w:r>
             <w:r>
-              <w:t xml:space="preserve"> </w:t>
-            </w:r>
-            <w:r>
-              <w:t xml:space="preserve">oltre Dashboard/Organizza/Acquisisci?</w:t>
-            </w:r>
-          </w:p>
-        </w:tc>
-        <w:tc>
-          <w:tcPr/>
-          <w:p>
-            <w:pPr>
-              <w:pStyle w:val="Compact"/>
-              <w:jc w:val="left"/>
-            </w:pPr>
-            <w:r>
-              <w:t xml:space="preserve">Prompt cita le tre; Aggiorna aiuta ma aggiunge densità</w:t>
-            </w:r>
-          </w:p>
-        </w:tc>
-        <w:tc>
-          <w:tcPr/>
-          <w:p>
-            <w:pPr>
-              <w:pStyle w:val="Compact"/>
-              <w:jc w:val="left"/>
-            </w:pPr>
-            <w:r>
-              <w:t xml:space="preserve">(a) sì compatta; (b) solo le tre sedi del prompt</w:t>
+              <w:t xml:space="preserve">, coerente con Dashboard/Organizza/Acquisisci</w:t>
+            </w:r>
+          </w:p>
+        </w:tc>
+        <w:tc>
+          <w:tcPr/>
+          <w:p>
+            <w:pPr>
+              <w:pStyle w:val="Compact"/>
+              <w:jc w:val="left"/>
+            </w:pPr>
+            <w:r>
+              <w:t xml:space="preserve">Contratto UI sede su quattro superfici</w:t>
             </w:r>
           </w:p>
         </w:tc>
@@ -5843,7 +6121,7 @@
         <w:pStyle w:val="BodyText"/>
       </w:pPr>
       <w:r>
-        <w:t xml:space="preserve">Nessun’altra fork di prodotto in questa proposta.</w:t>
+        <w:t xml:space="preserve">Nessuna ulteriore alternativa progettuale: il piano §E si esegue così com’è, con queste chiusure.</w:t>
       </w:r>
     </w:p>
     <w:p>
@@ -5853,8 +6131,8 @@
         </w:pict>
       </w:r>
     </w:p>
-    <w:bookmarkEnd w:id="45"/>
-    <w:bookmarkStart w:id="46" w:name="Xb2f39c068743091a6d1309a9b7144b6f206123c"/>
+    <w:bookmarkEnd w:id="46"/>
+    <w:bookmarkStart w:id="47" w:name="Xb2f39c068743091a6d1309a9b7144b6f206123c"/>
     <w:p>
       <w:pPr>
         <w:pStyle w:val="Heading2"/>
@@ -6159,8 +6437,8 @@
         </w:pict>
       </w:r>
     </w:p>
-    <w:bookmarkEnd w:id="46"/>
-    <w:bookmarkStart w:id="47" w:name="autorizzazione"/>
+    <w:bookmarkEnd w:id="47"/>
+    <w:bookmarkStart w:id="48" w:name="autorizzazione"/>
     <w:p>
       <w:pPr>
         <w:pStyle w:val="Heading2"/>
@@ -6178,39 +6456,33 @@
           <w:bCs/>
           <w:b/>
         </w:rPr>
-        <w:t xml:space="preserve">STOP.</w:t>
-      </w:r>
-      <w:r>
-        <w:t xml:space="preserve"> </w:t>
-      </w:r>
-      <w:r>
-        <w:t xml:space="preserve">Attendere revisione e</w:t>
-      </w:r>
-      <w:r>
-        <w:t xml:space="preserve"> </w:t>
+        <w:t xml:space="preserve">OK FINALE CURSOR (25/10/2026):</w:t>
+      </w:r>
+      <w:r>
+        <w:t xml:space="preserve"> </w:t>
+      </w:r>
+      <w:r>
+        <w:t xml:space="preserve">F1–F4 recepite; branch di riferimento documentato; piano §E senza ulteriori alternative.</w:t>
+      </w:r>
+      <w:r>
+        <w:br/>
       </w:r>
       <w:r>
         <w:rPr>
           <w:bCs/>
           <w:b/>
         </w:rPr>
-        <w:t xml:space="preserve">OK esplicito</w:t>
-      </w:r>
-      <w:r>
-        <w:t xml:space="preserve"> </w:t>
-      </w:r>
-      <w:r>
-        <w:t xml:space="preserve">di Renato (o OK con elenco puntuale di modifiche a questa proposta).</w:t>
-      </w:r>
-      <w:r>
-        <w:br/>
-      </w:r>
-      <w:r>
-        <w:t xml:space="preserve">Fino ad allora: nessun commit di codice applicativo, nessun branch di implementazione, nessun ciclo sperimentale.</w:t>
-      </w:r>
-    </w:p>
-    <w:bookmarkEnd w:id="47"/>
+        <w:t xml:space="preserve">Sviluppo autorizzato</w:t>
+      </w:r>
+      <w:r>
+        <w:t xml:space="preserve"> </w:t>
+      </w:r>
+      <w:r>
+        <w:t xml:space="preserve">da Renato subordinato a questo OK — si procede con la tranche su branch da 0.16.52.</w:t>
+      </w:r>
+    </w:p>
     <w:bookmarkEnd w:id="48"/>
+    <w:bookmarkEnd w:id="49"/>
     <w:sectPr/>
   </w:body>
 </w:document>

</xml_diff>